<commit_message>
Graphical abstract in Times-metric serif font; standardise all 12 placeholder tags; note legend-only supplementary tables
</commit_message>
<xml_diff>
--- a/submission_package/manuscript.docx
+++ b/submission_package/manuscript.docx
@@ -1670,85 +1670,116 @@
     </w:p>
     <w:tbl>
       <w:tblPr>
-        <w:tblStyle w:val="Table"/>
-        <w:tblW w:type="pct" w:w="5000"/>
-        <w:tblLayout w:type="fixed"/>
+        <w:jc w:val="center"/>
         <w:tblLook w:firstRow="1" w:lastRow="0" w:firstColumn="0" w:lastColumn="0" w:noHBand="0" w:noVBand="0" w:val="0020"/>
+        <w:tblStyle w:val="TableGrid"/>
+        <w:tblW w:w="5000" w:type="pct"/>
+        <w:tblLayout w:type="autofit"/>
       </w:tblPr>
       <w:tblGrid>
-        <w:gridCol w:w="1320"/>
-        <w:gridCol w:w="1320"/>
-        <w:gridCol w:w="1320"/>
-        <w:gridCol w:w="1320"/>
-        <w:gridCol w:w="1320"/>
-        <w:gridCol w:w="1320"/>
+        <w:gridCol w:w="1505"/>
+        <w:gridCol w:w="1505"/>
+        <w:gridCol w:w="1505"/>
+        <w:gridCol w:w="1505"/>
+        <w:gridCol w:w="1505"/>
+        <w:gridCol w:w="1505"/>
       </w:tblGrid>
       <w:tr>
         <w:trPr>
           <w:tblHeader w:val="on"/>
         </w:trPr>
         <w:tc>
-          <w:tcPr/>
+          <w:tcPr>
+            <w:tcW w:type="dxa" w:w="1505"/>
+          </w:tcPr>
           <w:p>
             <w:pPr>
               <w:pStyle w:val="Compact"/>
             </w:pPr>
             <w:r>
+              <w:rPr>
+                <w:b/>
+              </w:rPr>
               <w:t xml:space="preserve">Cohort</w:t>
             </w:r>
           </w:p>
         </w:tc>
         <w:tc>
-          <w:tcPr/>
+          <w:tcPr>
+            <w:tcW w:type="dxa" w:w="1505"/>
+          </w:tcPr>
           <w:p>
             <w:pPr>
               <w:pStyle w:val="Compact"/>
             </w:pPr>
             <w:r>
+              <w:rPr>
+                <w:b/>
+              </w:rPr>
               <w:t xml:space="preserve">Platform</w:t>
             </w:r>
           </w:p>
         </w:tc>
         <w:tc>
-          <w:tcPr/>
+          <w:tcPr>
+            <w:tcW w:type="dxa" w:w="1505"/>
+          </w:tcPr>
           <w:p>
             <w:pPr>
               <w:pStyle w:val="Compact"/>
             </w:pPr>
             <w:r>
+              <w:rPr>
+                <w:b/>
+              </w:rPr>
               <w:t xml:space="preserve">N (events)</w:t>
             </w:r>
           </w:p>
         </w:tc>
         <w:tc>
-          <w:tcPr/>
+          <w:tcPr>
+            <w:tcW w:type="dxa" w:w="1505"/>
+          </w:tcPr>
           <w:p>
             <w:pPr>
               <w:pStyle w:val="Compact"/>
             </w:pPr>
             <w:r>
+              <w:rPr>
+                <w:b/>
+              </w:rPr>
               <w:t xml:space="preserve">C-index</w:t>
             </w:r>
           </w:p>
         </w:tc>
         <w:tc>
-          <w:tcPr/>
+          <w:tcPr>
+            <w:tcW w:type="dxa" w:w="1505"/>
+          </w:tcPr>
           <w:p>
             <w:pPr>
               <w:pStyle w:val="Compact"/>
             </w:pPr>
             <w:r>
+              <w:rPr>
+                <w:b/>
+              </w:rPr>
               <w:t xml:space="preserve">Log-rank p</w:t>
             </w:r>
           </w:p>
         </w:tc>
         <w:tc>
-          <w:tcPr/>
+          <w:tcPr>
+            <w:tcW w:type="dxa" w:w="1505"/>
+          </w:tcPr>
           <w:p>
             <w:pPr>
               <w:pStyle w:val="Compact"/>
             </w:pPr>
             <w:r>
+              <w:rPr>
+                <w:b/>
+              </w:rPr>
               <w:t xml:space="preserve">HR high-vs-low (95% CI)</w:t>
             </w:r>
           </w:p>
@@ -1756,7 +1787,9 @@
       </w:tr>
       <w:tr>
         <w:tc>
-          <w:tcPr/>
+          <w:tcPr>
+            <w:tcW w:type="dxa" w:w="1505"/>
+          </w:tcPr>
           <w:p>
             <w:pPr>
               <w:pStyle w:val="Compact"/>
@@ -1767,7 +1800,9 @@
           </w:p>
         </w:tc>
         <w:tc>
-          <w:tcPr/>
+          <w:tcPr>
+            <w:tcW w:type="dxa" w:w="1505"/>
+          </w:tcPr>
           <w:p>
             <w:pPr>
               <w:pStyle w:val="Compact"/>
@@ -1778,7 +1813,9 @@
           </w:p>
         </w:tc>
         <w:tc>
-          <w:tcPr/>
+          <w:tcPr>
+            <w:tcW w:type="dxa" w:w="1505"/>
+          </w:tcPr>
           <w:p>
             <w:pPr>
               <w:pStyle w:val="Compact"/>
@@ -1789,7 +1826,9 @@
           </w:p>
         </w:tc>
         <w:tc>
-          <w:tcPr/>
+          <w:tcPr>
+            <w:tcW w:type="dxa" w:w="1505"/>
+          </w:tcPr>
           <w:p>
             <w:pPr>
               <w:pStyle w:val="Compact"/>
@@ -1800,7 +1839,9 @@
           </w:p>
         </w:tc>
         <w:tc>
-          <w:tcPr/>
+          <w:tcPr>
+            <w:tcW w:type="dxa" w:w="1505"/>
+          </w:tcPr>
           <w:p>
             <w:pPr>
               <w:pStyle w:val="Compact"/>
@@ -1811,7 +1852,9 @@
           </w:p>
         </w:tc>
         <w:tc>
-          <w:tcPr/>
+          <w:tcPr>
+            <w:tcW w:type="dxa" w:w="1505"/>
+          </w:tcPr>
           <w:p>
             <w:pPr>
               <w:pStyle w:val="Compact"/>
@@ -1824,7 +1867,9 @@
       </w:tr>
       <w:tr>
         <w:tc>
-          <w:tcPr/>
+          <w:tcPr>
+            <w:tcW w:type="dxa" w:w="1505"/>
+          </w:tcPr>
           <w:p>
             <w:pPr>
               <w:pStyle w:val="Compact"/>
@@ -1835,7 +1880,9 @@
           </w:p>
         </w:tc>
         <w:tc>
-          <w:tcPr/>
+          <w:tcPr>
+            <w:tcW w:type="dxa" w:w="1505"/>
+          </w:tcPr>
           <w:p>
             <w:pPr>
               <w:pStyle w:val="Compact"/>
@@ -1846,7 +1893,9 @@
           </w:p>
         </w:tc>
         <w:tc>
-          <w:tcPr/>
+          <w:tcPr>
+            <w:tcW w:type="dxa" w:w="1505"/>
+          </w:tcPr>
           <w:p>
             <w:pPr>
               <w:pStyle w:val="Compact"/>
@@ -1857,7 +1906,9 @@
           </w:p>
         </w:tc>
         <w:tc>
-          <w:tcPr/>
+          <w:tcPr>
+            <w:tcW w:type="dxa" w:w="1505"/>
+          </w:tcPr>
           <w:p>
             <w:pPr>
               <w:pStyle w:val="Compact"/>
@@ -1868,7 +1919,9 @@
           </w:p>
         </w:tc>
         <w:tc>
-          <w:tcPr/>
+          <w:tcPr>
+            <w:tcW w:type="dxa" w:w="1505"/>
+          </w:tcPr>
           <w:p>
             <w:pPr>
               <w:pStyle w:val="Compact"/>
@@ -1879,7 +1932,9 @@
           </w:p>
         </w:tc>
         <w:tc>
-          <w:tcPr/>
+          <w:tcPr>
+            <w:tcW w:type="dxa" w:w="1505"/>
+          </w:tcPr>
           <w:p>
             <w:pPr>
               <w:pStyle w:val="Compact"/>
@@ -1892,7 +1947,9 @@
       </w:tr>
       <w:tr>
         <w:tc>
-          <w:tcPr/>
+          <w:tcPr>
+            <w:tcW w:type="dxa" w:w="1505"/>
+          </w:tcPr>
           <w:p>
             <w:pPr>
               <w:pStyle w:val="Compact"/>
@@ -1903,7 +1960,9 @@
           </w:p>
         </w:tc>
         <w:tc>
-          <w:tcPr/>
+          <w:tcPr>
+            <w:tcW w:type="dxa" w:w="1505"/>
+          </w:tcPr>
           <w:p>
             <w:pPr>
               <w:pStyle w:val="Compact"/>
@@ -1914,7 +1973,9 @@
           </w:p>
         </w:tc>
         <w:tc>
-          <w:tcPr/>
+          <w:tcPr>
+            <w:tcW w:type="dxa" w:w="1505"/>
+          </w:tcPr>
           <w:p>
             <w:pPr>
               <w:pStyle w:val="Compact"/>
@@ -1925,7 +1986,9 @@
           </w:p>
         </w:tc>
         <w:tc>
-          <w:tcPr/>
+          <w:tcPr>
+            <w:tcW w:type="dxa" w:w="1505"/>
+          </w:tcPr>
           <w:p>
             <w:pPr>
               <w:pStyle w:val="Compact"/>
@@ -1936,7 +1999,9 @@
           </w:p>
         </w:tc>
         <w:tc>
-          <w:tcPr/>
+          <w:tcPr>
+            <w:tcW w:type="dxa" w:w="1505"/>
+          </w:tcPr>
           <w:p>
             <w:pPr>
               <w:pStyle w:val="Compact"/>
@@ -1947,7 +2012,9 @@
           </w:p>
         </w:tc>
         <w:tc>
-          <w:tcPr/>
+          <w:tcPr>
+            <w:tcW w:type="dxa" w:w="1505"/>
+          </w:tcPr>
           <w:p>
             <w:pPr>
               <w:pStyle w:val="Compact"/>
@@ -1960,7 +2027,9 @@
       </w:tr>
       <w:tr>
         <w:tc>
-          <w:tcPr/>
+          <w:tcPr>
+            <w:tcW w:type="dxa" w:w="1505"/>
+          </w:tcPr>
           <w:p>
             <w:pPr>
               <w:pStyle w:val="Compact"/>
@@ -1971,7 +2040,9 @@
           </w:p>
         </w:tc>
         <w:tc>
-          <w:tcPr/>
+          <w:tcPr>
+            <w:tcW w:type="dxa" w:w="1505"/>
+          </w:tcPr>
           <w:p>
             <w:pPr>
               <w:pStyle w:val="Compact"/>
@@ -1982,7 +2053,9 @@
           </w:p>
         </w:tc>
         <w:tc>
-          <w:tcPr/>
+          <w:tcPr>
+            <w:tcW w:type="dxa" w:w="1505"/>
+          </w:tcPr>
           <w:p>
             <w:pPr>
               <w:pStyle w:val="Compact"/>
@@ -1993,7 +2066,9 @@
           </w:p>
         </w:tc>
         <w:tc>
-          <w:tcPr/>
+          <w:tcPr>
+            <w:tcW w:type="dxa" w:w="1505"/>
+          </w:tcPr>
           <w:p>
             <w:pPr>
               <w:pStyle w:val="Compact"/>
@@ -2004,7 +2079,9 @@
           </w:p>
         </w:tc>
         <w:tc>
-          <w:tcPr/>
+          <w:tcPr>
+            <w:tcW w:type="dxa" w:w="1505"/>
+          </w:tcPr>
           <w:p>
             <w:pPr>
               <w:pStyle w:val="Compact"/>
@@ -2015,7 +2092,9 @@
           </w:p>
         </w:tc>
         <w:tc>
-          <w:tcPr/>
+          <w:tcPr>
+            <w:tcW w:type="dxa" w:w="1505"/>
+          </w:tcPr>
           <w:p>
             <w:pPr>
               <w:pStyle w:val="Compact"/>
@@ -3689,73 +3768,99 @@
     </w:p>
     <w:tbl>
       <w:tblPr>
-        <w:tblStyle w:val="Table"/>
-        <w:tblW w:type="pct" w:w="5000"/>
-        <w:tblLayout w:type="fixed"/>
+        <w:jc w:val="center"/>
         <w:tblLook w:firstRow="1" w:lastRow="0" w:firstColumn="0" w:lastColumn="0" w:noHBand="0" w:noVBand="0" w:val="0020"/>
+        <w:tblStyle w:val="TableGrid"/>
+        <w:tblW w:w="5000" w:type="pct"/>
+        <w:tblLayout w:type="autofit"/>
       </w:tblPr>
       <w:tblGrid>
-        <w:gridCol w:w="1584"/>
-        <w:gridCol w:w="1584"/>
-        <w:gridCol w:w="1584"/>
-        <w:gridCol w:w="1584"/>
-        <w:gridCol w:w="1584"/>
+        <w:gridCol w:w="1806"/>
+        <w:gridCol w:w="1806"/>
+        <w:gridCol w:w="1806"/>
+        <w:gridCol w:w="1806"/>
+        <w:gridCol w:w="1806"/>
       </w:tblGrid>
       <w:tr>
         <w:trPr>
           <w:tblHeader w:val="on"/>
         </w:trPr>
         <w:tc>
-          <w:tcPr/>
+          <w:tcPr>
+            <w:tcW w:type="dxa" w:w="1806"/>
+          </w:tcPr>
           <w:p>
             <w:pPr>
               <w:pStyle w:val="Compact"/>
             </w:pPr>
             <w:r>
+              <w:rPr>
+                <w:b/>
+              </w:rPr>
               <w:t xml:space="preserve">Exposure</w:t>
             </w:r>
           </w:p>
         </w:tc>
         <w:tc>
-          <w:tcPr/>
+          <w:tcPr>
+            <w:tcW w:type="dxa" w:w="1806"/>
+          </w:tcPr>
           <w:p>
             <w:pPr>
               <w:pStyle w:val="Compact"/>
             </w:pPr>
             <w:r>
+              <w:rPr>
+                <w:b/>
+              </w:rPr>
               <w:t xml:space="preserve">Axis</w:t>
             </w:r>
           </w:p>
         </w:tc>
         <w:tc>
-          <w:tcPr/>
+          <w:tcPr>
+            <w:tcW w:type="dxa" w:w="1806"/>
+          </w:tcPr>
           <w:p>
             <w:pPr>
               <w:pStyle w:val="Compact"/>
             </w:pPr>
             <w:r>
+              <w:rPr>
+                <w:b/>
+              </w:rPr>
               <w:t xml:space="preserve">nSNP</w:t>
             </w:r>
           </w:p>
         </w:tc>
         <w:tc>
-          <w:tcPr/>
+          <w:tcPr>
+            <w:tcW w:type="dxa" w:w="1806"/>
+          </w:tcPr>
           <w:p>
             <w:pPr>
               <w:pStyle w:val="Compact"/>
             </w:pPr>
             <w:r>
+              <w:rPr>
+                <w:b/>
+              </w:rPr>
               <w:t xml:space="preserve">IVW OR (95% CI)</w:t>
             </w:r>
           </w:p>
         </w:tc>
         <w:tc>
-          <w:tcPr/>
+          <w:tcPr>
+            <w:tcW w:type="dxa" w:w="1806"/>
+          </w:tcPr>
           <w:p>
             <w:pPr>
               <w:pStyle w:val="Compact"/>
             </w:pPr>
             <w:r>
+              <w:rPr>
+                <w:b/>
+              </w:rPr>
               <w:t xml:space="preserve">p</w:t>
             </w:r>
           </w:p>
@@ -3763,7 +3868,9 @@
       </w:tr>
       <w:tr>
         <w:tc>
-          <w:tcPr/>
+          <w:tcPr>
+            <w:tcW w:type="dxa" w:w="1806"/>
+          </w:tcPr>
           <w:p>
             <w:pPr>
               <w:pStyle w:val="Compact"/>
@@ -3787,7 +3894,9 @@
           </w:p>
         </w:tc>
         <w:tc>
-          <w:tcPr/>
+          <w:tcPr>
+            <w:tcW w:type="dxa" w:w="1806"/>
+          </w:tcPr>
           <w:p>
             <w:pPr>
               <w:pStyle w:val="Compact"/>
@@ -3802,7 +3911,9 @@
           </w:p>
         </w:tc>
         <w:tc>
-          <w:tcPr/>
+          <w:tcPr>
+            <w:tcW w:type="dxa" w:w="1806"/>
+          </w:tcPr>
           <w:p>
             <w:pPr>
               <w:pStyle w:val="Compact"/>
@@ -3813,7 +3924,9 @@
           </w:p>
         </w:tc>
         <w:tc>
-          <w:tcPr/>
+          <w:tcPr>
+            <w:tcW w:type="dxa" w:w="1806"/>
+          </w:tcPr>
           <w:p>
             <w:pPr>
               <w:pStyle w:val="Compact"/>
@@ -3824,7 +3937,9 @@
           </w:p>
         </w:tc>
         <w:tc>
-          <w:tcPr/>
+          <w:tcPr>
+            <w:tcW w:type="dxa" w:w="1806"/>
+          </w:tcPr>
           <w:p>
             <w:pPr>
               <w:pStyle w:val="Compact"/>
@@ -3837,7 +3952,9 @@
       </w:tr>
       <w:tr>
         <w:tc>
-          <w:tcPr/>
+          <w:tcPr>
+            <w:tcW w:type="dxa" w:w="1806"/>
+          </w:tcPr>
           <w:p>
             <w:pPr>
               <w:pStyle w:val="Compact"/>
@@ -3858,7 +3975,9 @@
           </w:p>
         </w:tc>
         <w:tc>
-          <w:tcPr/>
+          <w:tcPr>
+            <w:tcW w:type="dxa" w:w="1806"/>
+          </w:tcPr>
           <w:p>
             <w:pPr>
               <w:pStyle w:val="Compact"/>
@@ -3869,7 +3988,9 @@
           </w:p>
         </w:tc>
         <w:tc>
-          <w:tcPr/>
+          <w:tcPr>
+            <w:tcW w:type="dxa" w:w="1806"/>
+          </w:tcPr>
           <w:p>
             <w:pPr>
               <w:pStyle w:val="Compact"/>
@@ -3880,7 +4001,9 @@
           </w:p>
         </w:tc>
         <w:tc>
-          <w:tcPr/>
+          <w:tcPr>
+            <w:tcW w:type="dxa" w:w="1806"/>
+          </w:tcPr>
           <w:p>
             <w:pPr>
               <w:pStyle w:val="Compact"/>
@@ -3891,7 +4014,9 @@
           </w:p>
         </w:tc>
         <w:tc>
-          <w:tcPr/>
+          <w:tcPr>
+            <w:tcW w:type="dxa" w:w="1806"/>
+          </w:tcPr>
           <w:p>
             <w:pPr>
               <w:pStyle w:val="Compact"/>
@@ -3904,7 +4029,9 @@
       </w:tr>
       <w:tr>
         <w:tc>
-          <w:tcPr/>
+          <w:tcPr>
+            <w:tcW w:type="dxa" w:w="1806"/>
+          </w:tcPr>
           <w:p>
             <w:pPr>
               <w:pStyle w:val="Compact"/>
@@ -3925,7 +4052,9 @@
           </w:p>
         </w:tc>
         <w:tc>
-          <w:tcPr/>
+          <w:tcPr>
+            <w:tcW w:type="dxa" w:w="1806"/>
+          </w:tcPr>
           <w:p>
             <w:pPr>
               <w:pStyle w:val="Compact"/>
@@ -3936,7 +4065,9 @@
           </w:p>
         </w:tc>
         <w:tc>
-          <w:tcPr/>
+          <w:tcPr>
+            <w:tcW w:type="dxa" w:w="1806"/>
+          </w:tcPr>
           <w:p>
             <w:pPr>
               <w:pStyle w:val="Compact"/>
@@ -3947,7 +4078,9 @@
           </w:p>
         </w:tc>
         <w:tc>
-          <w:tcPr/>
+          <w:tcPr>
+            <w:tcW w:type="dxa" w:w="1806"/>
+          </w:tcPr>
           <w:p>
             <w:pPr>
               <w:pStyle w:val="Compact"/>
@@ -3958,7 +4091,9 @@
           </w:p>
         </w:tc>
         <w:tc>
-          <w:tcPr/>
+          <w:tcPr>
+            <w:tcW w:type="dxa" w:w="1806"/>
+          </w:tcPr>
           <w:p>
             <w:pPr>
               <w:pStyle w:val="Compact"/>
@@ -3971,7 +4106,9 @@
       </w:tr>
       <w:tr>
         <w:tc>
-          <w:tcPr/>
+          <w:tcPr>
+            <w:tcW w:type="dxa" w:w="1806"/>
+          </w:tcPr>
           <w:p>
             <w:pPr>
               <w:pStyle w:val="Compact"/>
@@ -3986,7 +4123,9 @@
           </w:p>
         </w:tc>
         <w:tc>
-          <w:tcPr/>
+          <w:tcPr>
+            <w:tcW w:type="dxa" w:w="1806"/>
+          </w:tcPr>
           <w:p>
             <w:pPr>
               <w:pStyle w:val="Compact"/>
@@ -3997,7 +4136,9 @@
           </w:p>
         </w:tc>
         <w:tc>
-          <w:tcPr/>
+          <w:tcPr>
+            <w:tcW w:type="dxa" w:w="1806"/>
+          </w:tcPr>
           <w:p>
             <w:pPr>
               <w:pStyle w:val="Compact"/>
@@ -4008,7 +4149,9 @@
           </w:p>
         </w:tc>
         <w:tc>
-          <w:tcPr/>
+          <w:tcPr>
+            <w:tcW w:type="dxa" w:w="1806"/>
+          </w:tcPr>
           <w:p>
             <w:pPr>
               <w:pStyle w:val="Compact"/>
@@ -4019,7 +4162,9 @@
           </w:p>
         </w:tc>
         <w:tc>
-          <w:tcPr/>
+          <w:tcPr>
+            <w:tcW w:type="dxa" w:w="1806"/>
+          </w:tcPr>
           <w:p>
             <w:pPr>
               <w:pStyle w:val="Compact"/>
@@ -4032,7 +4177,9 @@
       </w:tr>
       <w:tr>
         <w:tc>
-          <w:tcPr/>
+          <w:tcPr>
+            <w:tcW w:type="dxa" w:w="1806"/>
+          </w:tcPr>
           <w:p>
             <w:pPr>
               <w:pStyle w:val="Compact"/>
@@ -4047,7 +4194,9 @@
           </w:p>
         </w:tc>
         <w:tc>
-          <w:tcPr/>
+          <w:tcPr>
+            <w:tcW w:type="dxa" w:w="1806"/>
+          </w:tcPr>
           <w:p>
             <w:pPr>
               <w:pStyle w:val="Compact"/>
@@ -4058,7 +4207,9 @@
           </w:p>
         </w:tc>
         <w:tc>
-          <w:tcPr/>
+          <w:tcPr>
+            <w:tcW w:type="dxa" w:w="1806"/>
+          </w:tcPr>
           <w:p>
             <w:pPr>
               <w:pStyle w:val="Compact"/>
@@ -4069,7 +4220,9 @@
           </w:p>
         </w:tc>
         <w:tc>
-          <w:tcPr/>
+          <w:tcPr>
+            <w:tcW w:type="dxa" w:w="1806"/>
+          </w:tcPr>
           <w:p>
             <w:pPr>
               <w:pStyle w:val="Compact"/>
@@ -4080,7 +4233,9 @@
           </w:p>
         </w:tc>
         <w:tc>
-          <w:tcPr/>
+          <w:tcPr>
+            <w:tcW w:type="dxa" w:w="1806"/>
+          </w:tcPr>
           <w:p>
             <w:pPr>
               <w:pStyle w:val="Compact"/>
@@ -4093,7 +4248,9 @@
       </w:tr>
       <w:tr>
         <w:tc>
-          <w:tcPr/>
+          <w:tcPr>
+            <w:tcW w:type="dxa" w:w="1806"/>
+          </w:tcPr>
           <w:p>
             <w:pPr>
               <w:pStyle w:val="Compact"/>
@@ -4108,7 +4265,9 @@
           </w:p>
         </w:tc>
         <w:tc>
-          <w:tcPr/>
+          <w:tcPr>
+            <w:tcW w:type="dxa" w:w="1806"/>
+          </w:tcPr>
           <w:p>
             <w:pPr>
               <w:pStyle w:val="Compact"/>
@@ -4119,7 +4278,9 @@
           </w:p>
         </w:tc>
         <w:tc>
-          <w:tcPr/>
+          <w:tcPr>
+            <w:tcW w:type="dxa" w:w="1806"/>
+          </w:tcPr>
           <w:p>
             <w:pPr>
               <w:pStyle w:val="Compact"/>
@@ -4130,7 +4291,9 @@
           </w:p>
         </w:tc>
         <w:tc>
-          <w:tcPr/>
+          <w:tcPr>
+            <w:tcW w:type="dxa" w:w="1806"/>
+          </w:tcPr>
           <w:p>
             <w:pPr>
               <w:pStyle w:val="Compact"/>
@@ -4141,7 +4304,9 @@
           </w:p>
         </w:tc>
         <w:tc>
-          <w:tcPr/>
+          <w:tcPr>
+            <w:tcW w:type="dxa" w:w="1806"/>
+          </w:tcPr>
           <w:p>
             <w:pPr>
               <w:pStyle w:val="Compact"/>
@@ -5685,7 +5850,7 @@
         <w:t xml:space="preserve"> </w:t>
       </w:r>
       <w:r>
-        <w:t xml:space="preserve">This research received no specific grant from any funding agency in the public, commercial, or not-for-profit sectors. ⟦If a grant applies, replace with agency name and grant number.⟧</w:t>
+        <w:t xml:space="preserve">This research received no specific grant from any funding agency in the public, commercial, or not-for-profit sectors. ⟦PLACEHOLDER — if a grant applies, replace with agency name and grant number⟧</w:t>
       </w:r>
     </w:p>
     <w:p>
@@ -5721,7 +5886,7 @@
         <w:t xml:space="preserve"> </w:t>
       </w:r>
       <w:r>
-        <w:t xml:space="preserve">⟦AUTHOR INITIALS⟧ conceived and designed the study. ⟦AUTHOR INITIALS⟧ curated the public datasets and performed the bioinformatic and statistical analyses (differential expression, WGCNA, LASSO-Cox signature, immune deconvolution, single-cell, microbiome and Mendelian-randomisation pipelines). ⟦AUTHOR INITIALS⟧ interpreted the results. ⟦AUTHOR INITIALS⟧ drafted the manuscript; all authors critically revised it for important intellectual content. ⟦CORRESPONDING-AUTHOR INITIALS⟧ supervised the work. All authors read and approved the final manuscript. (Assign the bracketed initials to the named authors on the Title Page.)</w:t>
+        <w:t xml:space="preserve">⟦PLACEHOLDER — AUTHOR INITIALS⟧ conceived and designed the study. ⟦PLACEHOLDER — AUTHOR INITIALS⟧ curated the public datasets and performed the bioinformatic and statistical analyses (differential expression, WGCNA, LASSO-Cox signature, immune deconvolution, single-cell, microbiome and Mendelian-randomisation pipelines). ⟦PLACEHOLDER — AUTHOR INITIALS⟧ interpreted the results. ⟦PLACEHOLDER — AUTHOR INITIALS⟧ drafted the manuscript; all authors critically revised it for important intellectual content. ⟦PLACEHOLDER — CORRESPONDING-AUTHOR INITIALS⟧ supervised the work. All authors read and approved the final manuscript. (Assign the bracketed initials to the named authors on the Title Page.)</w:t>
       </w:r>
     </w:p>
     <w:p>

</xml_diff>